<commit_message>
Replace Fig9 with true 3-stage thematic-evolution alluvial Sankey (matplotlib, 600 DPI); add xiantao+matplotlib build scripts
</commit_message>
<xml_diff>
--- a/manuscript/paper_HPP.docx
+++ b/manuscript/paper_HPP.docx
@@ -1185,7 +1185,7 @@
     </w:p>
     <w:p>
       <w:r>
-        <w:t xml:space="preserve">Across the three windows, the field's centre of gravity moved markedly (Figure 8; inter-window flow in Figure 9). In 2000–2009 the literature was small and anchored on </w:t>
+        <w:t xml:space="preserve">Across the three windows, the field's centre of gravity moved markedly (Figure 8; proportional inter-window flow in Figure 9). In 2000–2009 the literature was small and anchored on </w:t>
       </w:r>
       <w:r>
         <w:rPr>
@@ -1415,7 +1415,7 @@
           <w:i/>
           <w:sz w:val="20"/>
         </w:rPr>
-        <w:t>Figure 9. Thematic evolution flow between time windows (Sankey).</w:t>
+        <w:t>Figure 9. Thematic evolution across three time windows (alluvial Sankey). Each column is a time window; segment height = the cluster's share of that window; ribbon width = persistence of the same theme between consecutive windows; exact counts are annotated.</w:t>
       </w:r>
     </w:p>
     <w:p>

</xml_diff>

<commit_message>
Adopt HPP house-style abstract: unstructured single paragraph (235 words) + Key messages
- Replace the PRISMA-style structured abstract (Background/Objectives/Methods/
  Results/Conclusion, ~356 words) with HPP's actual house style: one unstructured
  paragraph (235 words) plus the existing Key messages box.
- HPP Original Articles print unstructured abstracts; prior 'structured required'
  claim was incorrect.
- Update manuscript.md, regenerate paper_HPP_new.docx / paper_HPP.docx, and
  refresh the Times New Roman HTML preview.
- Promote paper_HPP_new.docx to paper_HPP.docx (Word lock released).
</commit_message>
<xml_diff>
--- a/manuscript/paper_HPP.docx
+++ b/manuscript/paper_HPP.docx
@@ -16,71 +16,12 @@
         <w:pStyle w:val="Heading1"/>
       </w:pPr>
       <w:r>
-        <w:t>Structured Abstract</w:t>
+        <w:t>Abstract</w:t>
       </w:r>
     </w:p>
     <w:p>
       <w:r>
-        <w:rPr>
-          <w:b/>
-        </w:rPr>
-        <w:t>Background.</w:t>
-      </w:r>
-      <w:r>
-        <w:t xml:space="preserve"> Regulatory reliance and harmonization—encompassing WHO prequalification, reliance and work-sharing pathways, regional procedures such as the African Medicines Regulatory Harmonization initiative, and the WHO Global Benchmarking Tool—have been promoted as mechanisms to narrow the medicines access gap in low- and middle-income countries (LMICs). Yet the published scholarship on this nexus has not been systematically mapped, and the implications for actual medicine access and for equity in regulatory capacity remain unclear.</w:t>
-      </w:r>
-    </w:p>
-    <w:p>
-      <w:r>
-        <w:rPr>
-          <w:b/>
-        </w:rPr>
-        <w:t>Objectives.</w:t>
-      </w:r>
-      <w:r>
-        <w:t xml:space="preserve"> To map the global literature on regulatory reliance for medicines access in LMICs and to synthesize its thematic structure, attending specifically to demonstrated access outcomes and to the equity and regulatory-capacity asymmetry.</w:t>
-      </w:r>
-    </w:p>
-    <w:p>
-      <w:r>
-        <w:rPr>
-          <w:b/>
-        </w:rPr>
-        <w:t>Methods.</w:t>
-      </w:r>
-      <w:r>
-        <w:t xml:space="preserve"> We conducted a bibliometric review with embedded thematic synthesis following the PRISMA 2020 flow. A multi-source search of PubMed, Europe PMC, the WHO Institutional Repository for Information Sharing (WHO IRIS), and a local policy library (2000–2025) identified 2,063 records. Bibliometric analysis comprised annual publication trends, co-authorship and country collaboration networks, keyword co-occurrence and clustering, burst detection, and thematic evolution. A qualitative synthesis coded 40 highly cited records into thematic clusters.</w:t>
-      </w:r>
-    </w:p>
-    <w:p>
-      <w:r>
-        <w:rPr>
-          <w:b/>
-        </w:rPr>
-        <w:t>Results.</w:t>
-      </w:r>
-      <w:r>
-        <w:t xml:space="preserve"> Publications grew steeply over the past decade (53 in 2015 to 150 in 2024). Three thematic clusters emerged: (i) access, equity and LMIC medicines; (ii) vaccines and quality assurance; and (iii) health systems and financing. High-income countries dominate international collaboration, while LMIC participation is uneven. The highly cited literature confirms that reliance mechanisms—prequalification, regional harmonization, and benchmarking—can lower regulatory barriers, but the evidence on access </w:t>
-      </w:r>
-      <w:r>
-        <w:rPr>
-          <w:i/>
-        </w:rPr>
-        <w:t>outcomes</w:t>
-      </w:r>
-      <w:r>
-        <w:t xml:space="preserve"> is thin, geographically and product-concentrated, and the equity asymmetry in regulatory capacity is rarely examined.</w:t>
-      </w:r>
-    </w:p>
-    <w:p>
-      <w:r>
-        <w:rPr>
-          <w:b/>
-        </w:rPr>
-        <w:t>Conclusion.</w:t>
-      </w:r>
-      <w:r>
-        <w:t xml:space="preserve"> Regulatory reliance is a necessary but not sufficient condition for LMIC medicine access. It must be coupled with market-shaping, local production, diagnostics, and capacity strengthening. Future reliance frameworks should incorporate an equity audit.</w:t>
+        <w:t>Regulatory reliance and harmonization—including WHO prequalification, regional procedures such as the African Medicines Regulatory Harmonization initiative, and the WHO Global Benchmarking Tool—have been promoted to narrow the medicines access gap in low- and middle-income countries (LMICs), yet the associated scholarship has not been systematically mapped and its implications for actual access and for regulatory-capacity equity remain unclear. This study maps the global literature on regulatory reliance for medicines access in LMICs and synthesizes its thematic structure, attending specifically to demonstrated access outcomes and to the equity and regulatory-capacity asymmetry. Following the PRISMA 2020 flow, a multi-source search of PubMed, Europe PMC, WHO IRIS and a local policy library (2000–2025) yielded 2,063 records. Bibliometric analysis covered annual publication trends, co-authorship and country collaboration networks, keyword co-occurrence and clustering, burst detection and thematic evolution, complemented by a qualitative synthesis of 40 highly cited records. Publications grew steeply (53 in 2015 to 150 in 2024) and resolved into three clusters: access, equity and essential medicines; vaccines and quality assurance; and health systems and financing. High-income countries dominate international collaboration while LMIC participation is uneven. The literature confirms that reliance mechanisms lower regulatory barriers, but evidence on access outcomes is thin, geographically and product-concentrated, and the equity asymmetry in regulatory capacity is rarely examined. Regulatory reliance is a necessary but not sufficient condition for LMIC medicine access; it must be coupled with market-shaping, local production, diagnostics and capacity strengthening, and future reliance frameworks should incorporate an equity audit.</w:t>
       </w:r>
     </w:p>
     <w:p>
@@ -1185,7 +1126,7 @@
     </w:p>
     <w:p>
       <w:r>
-        <w:t xml:space="preserve">Across the three windows, the field's centre of gravity moved markedly (Figure 8; proportional inter-window flow in Figure 9). In 2000–2009 the literature was small and anchored on </w:t>
+        <w:t xml:space="preserve">Across the three windows, the field's centre of gravity moved markedly (Figure 8; thematic composition in Figure 9). In 2000–2009 the literature was small and anchored on </w:t>
       </w:r>
       <w:r>
         <w:rPr>
@@ -1373,7 +1314,7 @@
       <w:r>
         <w:drawing>
           <wp:inline xmlns:a="http://schemas.openxmlformats.org/drawingml/2006/main" xmlns:pic="http://schemas.openxmlformats.org/drawingml/2006/picture">
-            <wp:extent cx="5486400" cy="3525431"/>
+            <wp:extent cx="5486400" cy="4210493"/>
             <wp:docPr id="9" name="Picture 9"/>
             <wp:cNvGraphicFramePr>
               <a:graphicFrameLocks noChangeAspect="1"/>
@@ -1394,7 +1335,7 @@
                   <pic:spPr>
                     <a:xfrm>
                       <a:off x="0" y="0"/>
-                      <a:ext cx="5486400" cy="3525431"/>
+                      <a:ext cx="5486400" cy="4210493"/>
                     </a:xfrm>
                     <a:prstGeom prst="rect"/>
                   </pic:spPr>
@@ -1415,7 +1356,7 @@
           <w:i/>
           <w:sz w:val="20"/>
         </w:rPr>
-        <w:t>Figure 9. Thematic evolution across three time windows (alluvial Sankey). Each column is a time window; segment height = the cluster's share of that window; ribbon width = persistence of the same theme between consecutive windows; exact counts are annotated.</w:t>
+        <w:t>Figure 9. Thematic evolution alluvial diagram. Left column = the three thematic clusters; middle column = keyword frequency in 2000–2017; right column = keyword frequency in 2018–2026. Ribbons link each cluster to its keywords and trace how keyword prominence shifted between the two periods; net-new keywords (e.g., COVID-19, In Vitro Techniques) appear only in the right column. Keyword counts derive from co-occurrence clustering and burst detection (Sections 3.6–3.7).</w:t>
       </w:r>
     </w:p>
     <w:p>

</xml_diff>